<commit_message>
teste univar sem ffill e junção petr4 com dolar
</commit_message>
<xml_diff>
--- a/resultados/IBOV/terminal.docx
+++ b/resultados/IBOV/terminal.docx
@@ -1,6 +1,6 @@
 
 <file path=word/document.xml><?xml version="1.0" encoding="utf-8"?>
-<w:document xmlns:wpc="http://schemas.microsoft.com/office/word/2010/wordprocessingCanvas" xmlns:cx="http://schemas.microsoft.com/office/drawing/2014/chartex" xmlns:cx1="http://schemas.microsoft.com/office/drawing/2015/9/8/chartex" xmlns:cx2="http://schemas.microsoft.com/office/drawing/2015/10/21/chartex" xmlns:cx3="http://schemas.microsoft.com/office/drawing/2016/5/9/chartex" xmlns:cx4="http://schemas.microsoft.com/office/drawing/2016/5/10/chartex" xmlns:cx5="http://schemas.microsoft.com/office/drawing/2016/5/11/chartex" xmlns:cx6="http://schemas.microsoft.com/office/drawing/2016/5/12/chartex" xmlns:cx7="http://schemas.microsoft.com/office/drawing/2016/5/13/chartex" xmlns:cx8="http://schemas.microsoft.com/office/drawing/2016/5/14/chartex" xmlns:mc="http://schemas.openxmlformats.org/markup-compatibility/2006" xmlns:aink="http://schemas.microsoft.com/office/drawing/2016/ink" xmlns:am3d="http://schemas.microsoft.com/office/drawing/2017/model3d" xmlns:o="urn:schemas-microsoft-com:office:office" xmlns:r="http://schemas.openxmlformats.org/officeDocument/2006/relationships" xmlns:m="http://schemas.openxmlformats.org/officeDocument/2006/math" xmlns:v="urn:schemas-microsoft-com:vml" xmlns:wp14="http://schemas.microsoft.com/office/word/2010/wordprocessingDrawing" xmlns:wp="http://schemas.openxmlformats.org/drawingml/2006/wordprocessingDrawing" xmlns:w10="urn:schemas-microsoft-com:office:word" xmlns:w="http://schemas.openxmlformats.org/wordprocessingml/2006/main" xmlns:w14="http://schemas.microsoft.com/office/word/2010/wordml" xmlns:w15="http://schemas.microsoft.com/office/word/2012/wordml" xmlns:w16cex="http://schemas.microsoft.com/office/word/2018/wordml/cex" xmlns:w16cid="http://schemas.microsoft.com/office/word/2016/wordml/cid" xmlns:w16="http://schemas.microsoft.com/office/word/2018/wordml" xmlns:w16sdtdh="http://schemas.microsoft.com/office/word/2020/wordml/sdtdatahash" xmlns:w16se="http://schemas.microsoft.com/office/word/2015/wordml/symex" xmlns:wpg="http://schemas.microsoft.com/office/word/2010/wordprocessingGroup" xmlns:wpi="http://schemas.microsoft.com/office/word/2010/wordprocessingInk" xmlns:wne="http://schemas.microsoft.com/office/word/2006/wordml" xmlns:wps="http://schemas.microsoft.com/office/word/2010/wordprocessingShape" mc:Ignorable="w14 w15 w16se w16cid w16 w16cex w16sdtdh wp14">
+<w:document xmlns:wpc="http://schemas.microsoft.com/office/word/2010/wordprocessingCanvas" xmlns:cx="http://schemas.microsoft.com/office/drawing/2014/chartex" xmlns:cx1="http://schemas.microsoft.com/office/drawing/2015/9/8/chartex" xmlns:cx2="http://schemas.microsoft.com/office/drawing/2015/10/21/chartex" xmlns:cx3="http://schemas.microsoft.com/office/drawing/2016/5/9/chartex" xmlns:cx4="http://schemas.microsoft.com/office/drawing/2016/5/10/chartex" xmlns:cx5="http://schemas.microsoft.com/office/drawing/2016/5/11/chartex" xmlns:cx6="http://schemas.microsoft.com/office/drawing/2016/5/12/chartex" xmlns:cx7="http://schemas.microsoft.com/office/drawing/2016/5/13/chartex" xmlns:cx8="http://schemas.microsoft.com/office/drawing/2016/5/14/chartex" xmlns:mc="http://schemas.openxmlformats.org/markup-compatibility/2006" xmlns:aink="http://schemas.microsoft.com/office/drawing/2016/ink" xmlns:am3d="http://schemas.microsoft.com/office/drawing/2017/model3d" xmlns:o="urn:schemas-microsoft-com:office:office" xmlns:oel="http://schemas.microsoft.com/office/2019/extlst" xmlns:r="http://schemas.openxmlformats.org/officeDocument/2006/relationships" xmlns:m="http://schemas.openxmlformats.org/officeDocument/2006/math" xmlns:v="urn:schemas-microsoft-com:vml" xmlns:wp14="http://schemas.microsoft.com/office/word/2010/wordprocessingDrawing" xmlns:wp="http://schemas.openxmlformats.org/drawingml/2006/wordprocessingDrawing" xmlns:w10="urn:schemas-microsoft-com:office:word" xmlns:w="http://schemas.openxmlformats.org/wordprocessingml/2006/main" xmlns:w14="http://schemas.microsoft.com/office/word/2010/wordml" xmlns:w15="http://schemas.microsoft.com/office/word/2012/wordml" xmlns:w16cex="http://schemas.microsoft.com/office/word/2018/wordml/cex" xmlns:w16cid="http://schemas.microsoft.com/office/word/2016/wordml/cid" xmlns:w16="http://schemas.microsoft.com/office/word/2018/wordml" xmlns:w16du="http://schemas.microsoft.com/office/word/2023/wordml/word16du" xmlns:w16sdtdh="http://schemas.microsoft.com/office/word/2020/wordml/sdtdatahash" xmlns:w16sdtfl="http://schemas.microsoft.com/office/word/2024/wordml/sdtformatlock" xmlns:w16se="http://schemas.microsoft.com/office/word/2015/wordml/symex" xmlns:wpg="http://schemas.microsoft.com/office/word/2010/wordprocessingGroup" xmlns:wpi="http://schemas.microsoft.com/office/word/2010/wordprocessingInk" xmlns:wne="http://schemas.microsoft.com/office/word/2006/wordml" xmlns:wps="http://schemas.microsoft.com/office/word/2010/wordprocessingShape" mc:Ignorable="w14 w15 w16se w16cid w16 w16cex w16sdtdh w16sdtfl w16du wp14">
   <w:body>
     <w:p>
       <w:r>
@@ -501,7 +501,15 @@
       </w:r>
     </w:p>
     <w:p>
-      <w:r>
+      <w:pPr>
+        <w:rPr>
+          <w:lang w:val="en-US"/>
+        </w:rPr>
+      </w:pPr>
+      <w:r>
+        <w:rPr>
+          <w:lang w:val="en-US"/>
+        </w:rPr>
         <w:t>Melhores hiperparâmetros LSTM encontrados: {'max_epochs': 50, 'module__hidden_size': 50, 'module__num_layers': 3, 'optimizer__lr': 0.001}</w:t>
       </w:r>
     </w:p>
@@ -2513,7 +2521,15 @@
       </w:r>
     </w:p>
     <w:p>
-      <w:r>
+      <w:pPr>
+        <w:rPr>
+          <w:lang w:val="en-US"/>
+        </w:rPr>
+      </w:pPr>
+      <w:r>
+        <w:rPr>
+          <w:lang w:val="en-US"/>
+        </w:rPr>
         <w:t>Melhores hiperparâmetros LSTM encontrados: {'max_epochs': 50, 'module__hidden_size': 50, 'module__num_layers': 3, 'optimizer__lr': 0.001}</w:t>
       </w:r>
     </w:p>
@@ -4241,29 +4257,13 @@
       </w:r>
     </w:p>
     <w:p>
-      <w:pPr>
-        <w:rPr>
-          <w:lang w:val="en-US"/>
-        </w:rPr>
-      </w:pPr>
-      <w:r>
-        <w:rPr>
-          <w:lang w:val="en-US"/>
-        </w:rPr>
+      <w:r>
         <w:lastRenderedPageBreak/>
         <w:t>27             1000.0  linear   0.01  0.005657</w:t>
       </w:r>
     </w:p>
     <w:p>
-      <w:pPr>
-        <w:rPr>
-          <w:lang w:val="en-US"/>
-        </w:rPr>
-      </w:pPr>
-      <w:r>
-        <w:rPr>
-          <w:lang w:val="en-US"/>
-        </w:rPr>
+      <w:r>
         <w:t>28             1000.0     rbf  scale  0.007038</w:t>
       </w:r>
     </w:p>
@@ -4830,7 +4830,15 @@
       </w:r>
     </w:p>
     <w:p>
-      <w:r>
+      <w:pPr>
+        <w:rPr>
+          <w:lang w:val="en-US"/>
+        </w:rPr>
+      </w:pPr>
+      <w:r>
+        <w:rPr>
+          <w:lang w:val="en-US"/>
+        </w:rPr>
         <w:t>Melhores hiperparâmetros LSTM encontrados: {'max_epochs': 20, 'module__hidden_size': 20, 'module__num_layers': 2, 'optimizer__lr': 0.001}</w:t>
       </w:r>
     </w:p>
@@ -7155,7 +7163,15 @@
       </w:r>
     </w:p>
     <w:p>
-      <w:r>
+      <w:pPr>
+        <w:rPr>
+          <w:lang w:val="en-US"/>
+        </w:rPr>
+      </w:pPr>
+      <w:r>
+        <w:rPr>
+          <w:lang w:val="en-US"/>
+        </w:rPr>
         <w:t>Melhores hiperparâmetros LSTM encontrados: {'max_epochs': 50, 'module__hidden_size': 50, 'module__num_layers': 2, 'optimizer__lr': 0.001}</w:t>
       </w:r>
     </w:p>
@@ -8923,22 +8939,54 @@
       </w:r>
     </w:p>
     <w:p>
-      <w:r>
+      <w:pPr>
+        <w:rPr>
+          <w:lang w:val="en-US"/>
+        </w:rPr>
+      </w:pPr>
+      <w:r>
+        <w:rPr>
+          <w:lang w:val="en-US"/>
+        </w:rPr>
         <w:t>RESULTADOS FINAIS LSTM (TESTE)</w:t>
       </w:r>
     </w:p>
     <w:p>
-      <w:r>
+      <w:pPr>
+        <w:rPr>
+          <w:lang w:val="en-US"/>
+        </w:rPr>
+      </w:pPr>
+      <w:r>
+        <w:rPr>
+          <w:lang w:val="en-US"/>
+        </w:rPr>
         <w:t>RMSE : 21634.6211</w:t>
       </w:r>
     </w:p>
     <w:p>
-      <w:r>
+      <w:pPr>
+        <w:rPr>
+          <w:lang w:val="en-US"/>
+        </w:rPr>
+      </w:pPr>
+      <w:r>
+        <w:rPr>
+          <w:lang w:val="en-US"/>
+        </w:rPr>
         <w:t>MAPE : 0.0972</w:t>
       </w:r>
     </w:p>
     <w:p>
-      <w:r>
+      <w:pPr>
+        <w:rPr>
+          <w:lang w:val="en-US"/>
+        </w:rPr>
+      </w:pPr>
+      <w:r>
+        <w:rPr>
+          <w:lang w:val="en-US"/>
+        </w:rPr>
         <w:t>RESULTADOS FINAIS SVR (TESTE)</w:t>
       </w:r>
     </w:p>
@@ -11914,8 +11962,2114 @@
       </w:r>
     </w:p>
     <w:p>
+      <w:pPr>
+        <w:pBdr>
+          <w:bottom w:val="single" w:sz="6" w:space="1" w:color="auto"/>
+        </w:pBdr>
+      </w:pPr>
       <w:r>
         <w:t>Taxa de Acerto Direcional SVR das primeiras 10 previsões: 60.00%</w:t>
+      </w:r>
+    </w:p>
+    <w:p>
+      <w:pPr>
+        <w:pBdr>
+          <w:bottom w:val="single" w:sz="6" w:space="1" w:color="auto"/>
+        </w:pBdr>
+      </w:pPr>
+    </w:p>
+    <w:p>
+      <w:r>
+        <w:t>Univar com dropna sem ffill</w:t>
+      </w:r>
+    </w:p>
+    <w:p>
+      <w:r>
+        <w:lastRenderedPageBreak/>
+        <w:t>(.venv) PS C:\Users\luiza\OneDrive - PSR\Documents\TCC&gt; &amp; "c:/Users/luiza/OneDrive - PSR/Documents/TCC/.venv/Scripts/python.exe" "c:/Users/luiza/OneDrive - PSR/Documents/TCC/univar_lstmXsvr.py"</w:t>
+      </w:r>
+    </w:p>
+    <w:p>
+      <w:r>
+        <w:t>Formato do x_treino: (3229, 21, 1)</w:t>
+      </w:r>
+    </w:p>
+    <w:p>
+      <w:r>
+        <w:t>Formato do y_treino: (3229, 1)</w:t>
+      </w:r>
+    </w:p>
+    <w:p>
+      <w:pPr>
+        <w:rPr>
+          <w:lang w:val="en-US"/>
+        </w:rPr>
+      </w:pPr>
+      <w:r>
+        <w:rPr>
+          <w:lang w:val="en-US"/>
+        </w:rPr>
+        <w:t>Fitting 3 folds for each of 36 candidates, totalling 108 fits</w:t>
+      </w:r>
+    </w:p>
+    <w:p>
+      <w:pPr>
+        <w:rPr>
+          <w:lang w:val="en-US"/>
+        </w:rPr>
+      </w:pPr>
+      <w:r>
+        <w:rPr>
+          <w:lang w:val="en-US"/>
+        </w:rPr>
+        <w:t>[CV] END max_epochs=20, module__hidden_size=20, module__num_layers=1, optimizer__lr=0.001; total time=   9.0s</w:t>
+      </w:r>
+    </w:p>
+    <w:p>
+      <w:pPr>
+        <w:rPr>
+          <w:lang w:val="en-US"/>
+        </w:rPr>
+      </w:pPr>
+      <w:r>
+        <w:rPr>
+          <w:lang w:val="en-US"/>
+        </w:rPr>
+        <w:t>[CV] END max_epochs=20, module__hidden_size=20, module__num_layers=1, optimizer__lr=0.001; total time=  10.4s</w:t>
+      </w:r>
+    </w:p>
+    <w:p>
+      <w:pPr>
+        <w:rPr>
+          <w:lang w:val="en-US"/>
+        </w:rPr>
+      </w:pPr>
+      <w:r>
+        <w:rPr>
+          <w:lang w:val="en-US"/>
+        </w:rPr>
+        <w:t>[CV] END max_epochs=20, module__hidden_size=20, module__num_layers=1, optimizer__lr=0.001; total time=  18.5s</w:t>
+      </w:r>
+    </w:p>
+    <w:p>
+      <w:pPr>
+        <w:rPr>
+          <w:lang w:val="en-US"/>
+        </w:rPr>
+      </w:pPr>
+      <w:r>
+        <w:rPr>
+          <w:lang w:val="en-US"/>
+        </w:rPr>
+        <w:t>[CV] END max_epochs=20, module__hidden_size=20, module__num_layers=1, optimizer__lr=0.01; total time=   5.1s</w:t>
+      </w:r>
+    </w:p>
+    <w:p>
+      <w:pPr>
+        <w:rPr>
+          <w:lang w:val="en-US"/>
+        </w:rPr>
+      </w:pPr>
+      <w:r>
+        <w:rPr>
+          <w:lang w:val="en-US"/>
+        </w:rPr>
+        <w:t>[CV] END max_epochs=20, module__hidden_size=20, module__num_layers=1, optimizer__lr=0.01; total time=  10.6s</w:t>
+      </w:r>
+    </w:p>
+    <w:p>
+      <w:pPr>
+        <w:rPr>
+          <w:lang w:val="en-US"/>
+        </w:rPr>
+      </w:pPr>
+      <w:r>
+        <w:rPr>
+          <w:lang w:val="en-US"/>
+        </w:rPr>
+        <w:t>[CV] END max_epochs=20, module__hidden_size=20, module__num_layers=1, optimizer__lr=0.01; total time=  17.1s</w:t>
+      </w:r>
+    </w:p>
+    <w:p>
+      <w:pPr>
+        <w:rPr>
+          <w:lang w:val="en-US"/>
+        </w:rPr>
+      </w:pPr>
+      <w:r>
+        <w:rPr>
+          <w:lang w:val="en-US"/>
+        </w:rPr>
+        <w:t>[CV] END max_epochs=20, module__hidden_size=20, module__num_layers=2, optimizer__lr=0.001; total time=  10.2s</w:t>
+      </w:r>
+    </w:p>
+    <w:p>
+      <w:pPr>
+        <w:rPr>
+          <w:lang w:val="en-US"/>
+        </w:rPr>
+      </w:pPr>
+      <w:r>
+        <w:rPr>
+          <w:lang w:val="en-US"/>
+        </w:rPr>
+        <w:t>[CV] END max_epochs=20, module__hidden_size=20, module__num_layers=2, optimizer__lr=0.001; total time=  20.3s</w:t>
+      </w:r>
+    </w:p>
+    <w:p>
+      <w:pPr>
+        <w:rPr>
+          <w:lang w:val="en-US"/>
+        </w:rPr>
+      </w:pPr>
+      <w:r>
+        <w:rPr>
+          <w:lang w:val="en-US"/>
+        </w:rPr>
+        <w:t>[CV] END max_epochs=20, module__hidden_size=20, module__num_layers=2, optimizer__lr=0.001; total time=  30.7s</w:t>
+      </w:r>
+    </w:p>
+    <w:p>
+      <w:pPr>
+        <w:rPr>
+          <w:lang w:val="en-US"/>
+        </w:rPr>
+      </w:pPr>
+      <w:r>
+        <w:rPr>
+          <w:lang w:val="en-US"/>
+        </w:rPr>
+        <w:t>[CV] END max_epochs=20, module__hidden_size=20, module__num_layers=2, optimizer__lr=0.01; total time=  11.4s</w:t>
+      </w:r>
+    </w:p>
+    <w:p>
+      <w:pPr>
+        <w:rPr>
+          <w:lang w:val="en-US"/>
+        </w:rPr>
+      </w:pPr>
+      <w:r>
+        <w:rPr>
+          <w:lang w:val="en-US"/>
+        </w:rPr>
+        <w:t>[CV] END max_epochs=20, module__hidden_size=20, module__num_layers=2, optimizer__lr=0.01; total time=  20.3s</w:t>
+      </w:r>
+    </w:p>
+    <w:p>
+      <w:pPr>
+        <w:rPr>
+          <w:lang w:val="en-US"/>
+        </w:rPr>
+      </w:pPr>
+      <w:r>
+        <w:rPr>
+          <w:lang w:val="en-US"/>
+        </w:rPr>
+        <w:t>[CV] END max_epochs=20, module__hidden_size=20, module__num_layers=2, optimizer__lr=0.01; total time=  32.4s</w:t>
+      </w:r>
+    </w:p>
+    <w:p>
+      <w:pPr>
+        <w:rPr>
+          <w:lang w:val="en-US"/>
+        </w:rPr>
+      </w:pPr>
+      <w:r>
+        <w:rPr>
+          <w:lang w:val="en-US"/>
+        </w:rPr>
+        <w:t>[CV] END max_epochs=20, module__hidden_size=20, module__num_layers=3, optimizer__lr=0.001; total time=  15.3s</w:t>
+      </w:r>
+    </w:p>
+    <w:p>
+      <w:pPr>
+        <w:rPr>
+          <w:lang w:val="en-US"/>
+        </w:rPr>
+      </w:pPr>
+      <w:r>
+        <w:rPr>
+          <w:lang w:val="en-US"/>
+        </w:rPr>
+        <w:t>[CV] END max_epochs=20, module__hidden_size=20, module__num_layers=3, optimizer__lr=0.001; total time=  30.3s</w:t>
+      </w:r>
+    </w:p>
+    <w:p>
+      <w:pPr>
+        <w:rPr>
+          <w:lang w:val="en-US"/>
+        </w:rPr>
+      </w:pPr>
+      <w:r>
+        <w:rPr>
+          <w:lang w:val="en-US"/>
+        </w:rPr>
+        <w:t>[CV] END max_epochs=20, module__hidden_size=20, module__num_layers=3, optimizer__lr=0.001; total time=  41.4s</w:t>
+      </w:r>
+    </w:p>
+    <w:p>
+      <w:pPr>
+        <w:rPr>
+          <w:lang w:val="en-US"/>
+        </w:rPr>
+      </w:pPr>
+      <w:r>
+        <w:rPr>
+          <w:lang w:val="en-US"/>
+        </w:rPr>
+        <w:lastRenderedPageBreak/>
+        <w:t>[CV] END max_epochs=20, module__hidden_size=20, module__num_layers=3, optimizer__lr=0.01; total time=  12.4s</w:t>
+      </w:r>
+    </w:p>
+    <w:p>
+      <w:pPr>
+        <w:rPr>
+          <w:lang w:val="en-US"/>
+        </w:rPr>
+      </w:pPr>
+      <w:r>
+        <w:rPr>
+          <w:lang w:val="en-US"/>
+        </w:rPr>
+        <w:t>[CV] END max_epochs=20, module__hidden_size=20, module__num_layers=3, optimizer__lr=0.01; total time=  24.5s</w:t>
+      </w:r>
+    </w:p>
+    <w:p>
+      <w:pPr>
+        <w:rPr>
+          <w:lang w:val="en-US"/>
+        </w:rPr>
+      </w:pPr>
+      <w:r>
+        <w:rPr>
+          <w:lang w:val="en-US"/>
+        </w:rPr>
+        <w:t>[CV] END max_epochs=20, module__hidden_size=20, module__num_layers=3, optimizer__lr=0.01; total time=  36.3s</w:t>
+      </w:r>
+    </w:p>
+    <w:p>
+      <w:pPr>
+        <w:rPr>
+          <w:lang w:val="en-US"/>
+        </w:rPr>
+      </w:pPr>
+      <w:r>
+        <w:rPr>
+          <w:lang w:val="en-US"/>
+        </w:rPr>
+        <w:t>[CV] END max_epochs=20, module__hidden_size=50, module__num_layers=1, optimizer__lr=0.001; total time=   6.3s</w:t>
+      </w:r>
+    </w:p>
+    <w:p>
+      <w:pPr>
+        <w:rPr>
+          <w:lang w:val="en-US"/>
+        </w:rPr>
+      </w:pPr>
+      <w:r>
+        <w:rPr>
+          <w:lang w:val="en-US"/>
+        </w:rPr>
+        <w:t>[CV] END max_epochs=20, module__hidden_size=50, module__num_layers=1, optimizer__lr=0.001; total time=  12.8s</w:t>
+      </w:r>
+    </w:p>
+    <w:p>
+      <w:pPr>
+        <w:rPr>
+          <w:lang w:val="en-US"/>
+        </w:rPr>
+      </w:pPr>
+      <w:r>
+        <w:rPr>
+          <w:lang w:val="en-US"/>
+        </w:rPr>
+        <w:t>[CV] END max_epochs=20, module__hidden_size=50, module__num_layers=1, optimizer__lr=0.001; total time=  38.7s</w:t>
+      </w:r>
+    </w:p>
+    <w:p>
+      <w:pPr>
+        <w:rPr>
+          <w:lang w:val="en-US"/>
+        </w:rPr>
+      </w:pPr>
+      <w:r>
+        <w:rPr>
+          <w:lang w:val="en-US"/>
+        </w:rPr>
+        <w:t>[CV] END max_epochs=20, module__hidden_size=50, module__num_layers=1, optimizer__lr=0.01; total time=  16.2s</w:t>
+      </w:r>
+    </w:p>
+    <w:p>
+      <w:pPr>
+        <w:rPr>
+          <w:lang w:val="en-US"/>
+        </w:rPr>
+      </w:pPr>
+      <w:r>
+        <w:rPr>
+          <w:lang w:val="en-US"/>
+        </w:rPr>
+        <w:t>[CV] END max_epochs=20, module__hidden_size=50, module__num_layers=1, optimizer__lr=0.01; total time=  31.8s</w:t>
+      </w:r>
+    </w:p>
+    <w:p>
+      <w:pPr>
+        <w:rPr>
+          <w:lang w:val="en-US"/>
+        </w:rPr>
+      </w:pPr>
+      <w:r>
+        <w:rPr>
+          <w:lang w:val="en-US"/>
+        </w:rPr>
+        <w:t>[CV] END max_epochs=20, module__hidden_size=50, module__num_layers=1, optimizer__lr=0.01; total time=  51.2s</w:t>
+      </w:r>
+    </w:p>
+    <w:p>
+      <w:pPr>
+        <w:rPr>
+          <w:lang w:val="en-US"/>
+        </w:rPr>
+      </w:pPr>
+      <w:r>
+        <w:rPr>
+          <w:lang w:val="en-US"/>
+        </w:rPr>
+        <w:t>[CV] END max_epochs=20, module__hidden_size=50, module__num_layers=2, optimizer__lr=0.001; total time=  31.9s</w:t>
+      </w:r>
+    </w:p>
+    <w:p>
+      <w:pPr>
+        <w:rPr>
+          <w:lang w:val="en-US"/>
+        </w:rPr>
+      </w:pPr>
+      <w:r>
+        <w:rPr>
+          <w:lang w:val="en-US"/>
+        </w:rPr>
+        <w:t>[CV] END max_epochs=20, module__hidden_size=50, module__num_layers=2, optimizer__lr=0.001; total time=  56.3s</w:t>
+      </w:r>
+    </w:p>
+    <w:p>
+      <w:pPr>
+        <w:rPr>
+          <w:lang w:val="en-US"/>
+        </w:rPr>
+      </w:pPr>
+      <w:r>
+        <w:rPr>
+          <w:lang w:val="en-US"/>
+        </w:rPr>
+        <w:t>[CV] END max_epochs=20, module__hidden_size=50, module__num_layers=2, optimizer__lr=0.001; total time= 1.4min</w:t>
+      </w:r>
+    </w:p>
+    <w:p>
+      <w:pPr>
+        <w:rPr>
+          <w:lang w:val="en-US"/>
+        </w:rPr>
+      </w:pPr>
+      <w:r>
+        <w:rPr>
+          <w:lang w:val="en-US"/>
+        </w:rPr>
+        <w:t>[CV] END max_epochs=20, module__hidden_size=50, module__num_layers=2, optimizer__lr=0.01; total time=  29.0s</w:t>
+      </w:r>
+    </w:p>
+    <w:p>
+      <w:pPr>
+        <w:rPr>
+          <w:lang w:val="en-US"/>
+        </w:rPr>
+      </w:pPr>
+      <w:r>
+        <w:rPr>
+          <w:lang w:val="en-US"/>
+        </w:rPr>
+        <w:t>[CV] END max_epochs=20, module__hidden_size=50, module__num_layers=2, optimizer__lr=0.01; total time=  56.3s</w:t>
+      </w:r>
+    </w:p>
+    <w:p>
+      <w:pPr>
+        <w:rPr>
+          <w:lang w:val="en-US"/>
+        </w:rPr>
+      </w:pPr>
+      <w:r>
+        <w:rPr>
+          <w:lang w:val="en-US"/>
+        </w:rPr>
+        <w:t>[CV] END max_epochs=20, module__hidden_size=50, module__num_layers=2, optimizer__lr=0.01; total time= 1.5min</w:t>
+      </w:r>
+    </w:p>
+    <w:p>
+      <w:pPr>
+        <w:rPr>
+          <w:lang w:val="en-US"/>
+        </w:rPr>
+      </w:pPr>
+      <w:r>
+        <w:rPr>
+          <w:lang w:val="en-US"/>
+        </w:rPr>
+        <w:t>[CV] END max_epochs=20, module__hidden_size=50, module__num_layers=3, optimizer__lr=0.001; total time=  44.8s</w:t>
+      </w:r>
+    </w:p>
+    <w:p>
+      <w:pPr>
+        <w:rPr>
+          <w:lang w:val="en-US"/>
+        </w:rPr>
+      </w:pPr>
+      <w:r>
+        <w:rPr>
+          <w:lang w:val="en-US"/>
+        </w:rPr>
+        <w:t>[CV] END max_epochs=20, module__hidden_size=50, module__num_layers=3, optimizer__lr=0.001; total time= 1.4min</w:t>
+      </w:r>
+    </w:p>
+    <w:p>
+      <w:pPr>
+        <w:rPr>
+          <w:lang w:val="en-US"/>
+        </w:rPr>
+      </w:pPr>
+      <w:r>
+        <w:rPr>
+          <w:lang w:val="en-US"/>
+        </w:rPr>
+        <w:t>[CV] END max_epochs=20, module__hidden_size=50, module__num_layers=3, optimizer__lr=0.001; total time= 1.9min</w:t>
+      </w:r>
+    </w:p>
+    <w:p>
+      <w:pPr>
+        <w:rPr>
+          <w:lang w:val="en-US"/>
+        </w:rPr>
+      </w:pPr>
+      <w:r>
+        <w:rPr>
+          <w:lang w:val="en-US"/>
+        </w:rPr>
+        <w:t>[CV] END max_epochs=20, module__hidden_size=50, module__num_layers=3, optimizer__lr=0.01; total time=  39.7s</w:t>
+      </w:r>
+    </w:p>
+    <w:p>
+      <w:pPr>
+        <w:rPr>
+          <w:lang w:val="en-US"/>
+        </w:rPr>
+      </w:pPr>
+      <w:r>
+        <w:rPr>
+          <w:lang w:val="en-US"/>
+        </w:rPr>
+        <w:lastRenderedPageBreak/>
+        <w:t>[CV] END max_epochs=20, module__hidden_size=50, module__num_layers=3, optimizer__lr=0.01; total time= 1.3min</w:t>
+      </w:r>
+    </w:p>
+    <w:p>
+      <w:pPr>
+        <w:rPr>
+          <w:lang w:val="en-US"/>
+        </w:rPr>
+      </w:pPr>
+      <w:r>
+        <w:rPr>
+          <w:lang w:val="en-US"/>
+        </w:rPr>
+        <w:t>[CV] END max_epochs=20, module__hidden_size=50, module__num_layers=3, optimizer__lr=0.01; total time= 1.9min</w:t>
+      </w:r>
+    </w:p>
+    <w:p>
+      <w:pPr>
+        <w:rPr>
+          <w:lang w:val="en-US"/>
+        </w:rPr>
+      </w:pPr>
+      <w:r>
+        <w:rPr>
+          <w:lang w:val="en-US"/>
+        </w:rPr>
+        <w:t>[CV] END max_epochs=50, module__hidden_size=20, module__num_layers=1, optimizer__lr=0.001; total time=  26.1s</w:t>
+      </w:r>
+    </w:p>
+    <w:p>
+      <w:pPr>
+        <w:rPr>
+          <w:lang w:val="en-US"/>
+        </w:rPr>
+      </w:pPr>
+      <w:r>
+        <w:rPr>
+          <w:lang w:val="en-US"/>
+        </w:rPr>
+        <w:t>[CV] END max_epochs=50, module__hidden_size=20, module__num_layers=1, optimizer__lr=0.001; total time=  54.1s</w:t>
+      </w:r>
+    </w:p>
+    <w:p>
+      <w:pPr>
+        <w:rPr>
+          <w:lang w:val="en-US"/>
+        </w:rPr>
+      </w:pPr>
+      <w:r>
+        <w:rPr>
+          <w:lang w:val="en-US"/>
+        </w:rPr>
+        <w:t>[CV] END max_epochs=50, module__hidden_size=20, module__num_layers=1, optimizer__lr=0.001; total time= 1.3min</w:t>
+      </w:r>
+    </w:p>
+    <w:p>
+      <w:pPr>
+        <w:rPr>
+          <w:lang w:val="en-US"/>
+        </w:rPr>
+      </w:pPr>
+      <w:r>
+        <w:rPr>
+          <w:lang w:val="en-US"/>
+        </w:rPr>
+        <w:t>[CV] END max_epochs=50, module__hidden_size=20, module__num_layers=1, optimizer__lr=0.01; total time=  27.3s</w:t>
+      </w:r>
+    </w:p>
+    <w:p>
+      <w:pPr>
+        <w:rPr>
+          <w:lang w:val="en-US"/>
+        </w:rPr>
+      </w:pPr>
+      <w:r>
+        <w:rPr>
+          <w:lang w:val="en-US"/>
+        </w:rPr>
+        <w:t>[CV] END max_epochs=50, module__hidden_size=20, module__num_layers=1, optimizer__lr=0.01; total time= 1.1min</w:t>
+      </w:r>
+    </w:p>
+    <w:p>
+      <w:pPr>
+        <w:rPr>
+          <w:lang w:val="en-US"/>
+        </w:rPr>
+      </w:pPr>
+      <w:r>
+        <w:rPr>
+          <w:lang w:val="en-US"/>
+        </w:rPr>
+        <w:t>[CV] END max_epochs=50, module__hidden_size=20, module__num_layers=1, optimizer__lr=0.01; total time= 1.6min</w:t>
+      </w:r>
+    </w:p>
+    <w:p>
+      <w:pPr>
+        <w:rPr>
+          <w:lang w:val="en-US"/>
+        </w:rPr>
+      </w:pPr>
+      <w:r>
+        <w:rPr>
+          <w:lang w:val="en-US"/>
+        </w:rPr>
+        <w:t>[CV] END max_epochs=50, module__hidden_size=20, module__num_layers=2, optimizer__lr=0.001; total time=  49.9s</w:t>
+      </w:r>
+    </w:p>
+    <w:p>
+      <w:pPr>
+        <w:rPr>
+          <w:lang w:val="en-US"/>
+        </w:rPr>
+      </w:pPr>
+      <w:r>
+        <w:rPr>
+          <w:lang w:val="en-US"/>
+        </w:rPr>
+        <w:t>[CV] END max_epochs=50, module__hidden_size=20, module__num_layers=2, optimizer__lr=0.001; total time= 1.6min</w:t>
+      </w:r>
+    </w:p>
+    <w:p>
+      <w:pPr>
+        <w:rPr>
+          <w:lang w:val="en-US"/>
+        </w:rPr>
+      </w:pPr>
+      <w:r>
+        <w:rPr>
+          <w:lang w:val="en-US"/>
+        </w:rPr>
+        <w:t>[CV] END max_epochs=50, module__hidden_size=20, module__num_layers=2, optimizer__lr=0.001; total time= 2.4min</w:t>
+      </w:r>
+    </w:p>
+    <w:p>
+      <w:pPr>
+        <w:rPr>
+          <w:lang w:val="en-US"/>
+        </w:rPr>
+      </w:pPr>
+      <w:r>
+        <w:rPr>
+          <w:lang w:val="en-US"/>
+        </w:rPr>
+        <w:t>[CV] END max_epochs=50, module__hidden_size=20, module__num_layers=2, optimizer__lr=0.01; total time=  47.7s</w:t>
+      </w:r>
+    </w:p>
+    <w:p>
+      <w:pPr>
+        <w:rPr>
+          <w:lang w:val="en-US"/>
+        </w:rPr>
+      </w:pPr>
+      <w:r>
+        <w:rPr>
+          <w:lang w:val="en-US"/>
+        </w:rPr>
+        <w:t>[CV] END max_epochs=50, module__hidden_size=20, module__num_layers=2, optimizer__lr=0.01; total time= 1.5min</w:t>
+      </w:r>
+    </w:p>
+    <w:p>
+      <w:pPr>
+        <w:rPr>
+          <w:lang w:val="en-US"/>
+        </w:rPr>
+      </w:pPr>
+      <w:r>
+        <w:rPr>
+          <w:lang w:val="en-US"/>
+        </w:rPr>
+        <w:t>[CV] END max_epochs=50, module__hidden_size=20, module__num_layers=2, optimizer__lr=0.01; total time= 2.3min</w:t>
+      </w:r>
+    </w:p>
+    <w:p>
+      <w:pPr>
+        <w:rPr>
+          <w:lang w:val="en-US"/>
+        </w:rPr>
+      </w:pPr>
+      <w:r>
+        <w:rPr>
+          <w:lang w:val="en-US"/>
+        </w:rPr>
+        <w:t>[CV] END max_epochs=50, module__hidden_size=20, module__num_layers=3, optimizer__lr=0.001; total time= 1.1min</w:t>
+      </w:r>
+    </w:p>
+    <w:p>
+      <w:pPr>
+        <w:rPr>
+          <w:lang w:val="en-US"/>
+        </w:rPr>
+      </w:pPr>
+      <w:r>
+        <w:rPr>
+          <w:lang w:val="en-US"/>
+        </w:rPr>
+        <w:t>[CV] END max_epochs=50, module__hidden_size=20, module__num_layers=3, optimizer__lr=0.001; total time= 2.2min</w:t>
+      </w:r>
+    </w:p>
+    <w:p>
+      <w:pPr>
+        <w:rPr>
+          <w:lang w:val="en-US"/>
+        </w:rPr>
+      </w:pPr>
+      <w:r>
+        <w:rPr>
+          <w:lang w:val="en-US"/>
+        </w:rPr>
+        <w:t>[CV] END max_epochs=50, module__hidden_size=20, module__num_layers=3, optimizer__lr=0.001; total time= 3.3min</w:t>
+      </w:r>
+    </w:p>
+    <w:p>
+      <w:pPr>
+        <w:rPr>
+          <w:lang w:val="en-US"/>
+        </w:rPr>
+      </w:pPr>
+      <w:r>
+        <w:rPr>
+          <w:lang w:val="en-US"/>
+        </w:rPr>
+        <w:t>[CV] END max_epochs=50, module__hidden_size=20, module__num_layers=3, optimizer__lr=0.01; total time= 1.1min</w:t>
+      </w:r>
+    </w:p>
+    <w:p>
+      <w:pPr>
+        <w:rPr>
+          <w:lang w:val="en-US"/>
+        </w:rPr>
+      </w:pPr>
+      <w:r>
+        <w:rPr>
+          <w:lang w:val="en-US"/>
+        </w:rPr>
+        <w:t>[CV] END max_epochs=50, module__hidden_size=20, module__num_layers=3, optimizer__lr=0.01; total time= 2.2min</w:t>
+      </w:r>
+    </w:p>
+    <w:p>
+      <w:pPr>
+        <w:rPr>
+          <w:lang w:val="en-US"/>
+        </w:rPr>
+      </w:pPr>
+      <w:r>
+        <w:rPr>
+          <w:lang w:val="en-US"/>
+        </w:rPr>
+        <w:lastRenderedPageBreak/>
+        <w:t>[CV] END max_epochs=50, module__hidden_size=20, module__num_layers=3, optimizer__lr=0.01; total time= 3.3min</w:t>
+      </w:r>
+    </w:p>
+    <w:p>
+      <w:pPr>
+        <w:rPr>
+          <w:lang w:val="en-US"/>
+        </w:rPr>
+      </w:pPr>
+      <w:r>
+        <w:rPr>
+          <w:lang w:val="en-US"/>
+        </w:rPr>
+        <w:t>[CV] END max_epochs=50, module__hidden_size=50, module__num_layers=1, optimizer__lr=0.001; total time=  41.6s</w:t>
+      </w:r>
+    </w:p>
+    <w:p>
+      <w:pPr>
+        <w:rPr>
+          <w:lang w:val="en-US"/>
+        </w:rPr>
+      </w:pPr>
+      <w:r>
+        <w:rPr>
+          <w:lang w:val="en-US"/>
+        </w:rPr>
+        <w:t>[CV] END max_epochs=50, module__hidden_size=50, module__num_layers=1, optimizer__lr=0.001; total time= 1.2min</w:t>
+      </w:r>
+    </w:p>
+    <w:p>
+      <w:pPr>
+        <w:rPr>
+          <w:lang w:val="en-US"/>
+        </w:rPr>
+      </w:pPr>
+      <w:r>
+        <w:rPr>
+          <w:lang w:val="en-US"/>
+        </w:rPr>
+        <w:t>[CV] END max_epochs=50, module__hidden_size=50, module__num_layers=1, optimizer__lr=0.001; total time= 1.7min</w:t>
+      </w:r>
+    </w:p>
+    <w:p>
+      <w:pPr>
+        <w:rPr>
+          <w:lang w:val="en-US"/>
+        </w:rPr>
+      </w:pPr>
+      <w:r>
+        <w:rPr>
+          <w:lang w:val="en-US"/>
+        </w:rPr>
+        <w:t>[CV] END max_epochs=50, module__hidden_size=50, module__num_layers=1, optimizer__lr=0.01; total time=  34.8s</w:t>
+      </w:r>
+    </w:p>
+    <w:p>
+      <w:pPr>
+        <w:rPr>
+          <w:lang w:val="en-US"/>
+        </w:rPr>
+      </w:pPr>
+      <w:r>
+        <w:rPr>
+          <w:lang w:val="en-US"/>
+        </w:rPr>
+        <w:t>[CV] END max_epochs=50, module__hidden_size=50, module__num_layers=1, optimizer__lr=0.01; total time= 1.2min</w:t>
+      </w:r>
+    </w:p>
+    <w:p>
+      <w:pPr>
+        <w:rPr>
+          <w:lang w:val="en-US"/>
+        </w:rPr>
+      </w:pPr>
+      <w:r>
+        <w:rPr>
+          <w:lang w:val="en-US"/>
+        </w:rPr>
+        <w:t>[CV] END max_epochs=50, module__hidden_size=50, module__num_layers=1, optimizer__lr=0.01; total time= 1.7min</w:t>
+      </w:r>
+    </w:p>
+    <w:p>
+      <w:pPr>
+        <w:rPr>
+          <w:lang w:val="en-US"/>
+        </w:rPr>
+      </w:pPr>
+      <w:r>
+        <w:rPr>
+          <w:lang w:val="en-US"/>
+        </w:rPr>
+        <w:t>[CV] END max_epochs=50, module__hidden_size=50, module__num_layers=2, optimizer__lr=0.001; total time= 1.1min</w:t>
+      </w:r>
+    </w:p>
+    <w:p>
+      <w:pPr>
+        <w:rPr>
+          <w:lang w:val="en-US"/>
+        </w:rPr>
+      </w:pPr>
+      <w:r>
+        <w:rPr>
+          <w:lang w:val="en-US"/>
+        </w:rPr>
+        <w:t>[CV] END max_epochs=50, module__hidden_size=50, module__num_layers=2, optimizer__lr=0.001; total time= 2.2min</w:t>
+      </w:r>
+    </w:p>
+    <w:p>
+      <w:pPr>
+        <w:rPr>
+          <w:lang w:val="en-US"/>
+        </w:rPr>
+      </w:pPr>
+      <w:r>
+        <w:rPr>
+          <w:lang w:val="en-US"/>
+        </w:rPr>
+        <w:t>[CV] END max_epochs=50, module__hidden_size=50, module__num_layers=2, optimizer__lr=0.001; total time= 3.2min</w:t>
+      </w:r>
+    </w:p>
+    <w:p>
+      <w:pPr>
+        <w:rPr>
+          <w:lang w:val="en-US"/>
+        </w:rPr>
+      </w:pPr>
+      <w:r>
+        <w:rPr>
+          <w:lang w:val="en-US"/>
+        </w:rPr>
+        <w:t>[CV] END max_epochs=50, module__hidden_size=50, module__num_layers=2, optimizer__lr=0.01; total time= 1.1min</w:t>
+      </w:r>
+    </w:p>
+    <w:p>
+      <w:pPr>
+        <w:rPr>
+          <w:lang w:val="en-US"/>
+        </w:rPr>
+      </w:pPr>
+      <w:r>
+        <w:rPr>
+          <w:lang w:val="en-US"/>
+        </w:rPr>
+        <w:t>[CV] END max_epochs=50, module__hidden_size=50, module__num_layers=2, optimizer__lr=0.01; total time= 2.2min</w:t>
+      </w:r>
+    </w:p>
+    <w:p>
+      <w:pPr>
+        <w:rPr>
+          <w:lang w:val="en-US"/>
+        </w:rPr>
+      </w:pPr>
+      <w:r>
+        <w:rPr>
+          <w:lang w:val="en-US"/>
+        </w:rPr>
+        <w:t>[CV] END max_epochs=50, module__hidden_size=50, module__num_layers=2, optimizer__lr=0.01; total time= 3.3min</w:t>
+      </w:r>
+    </w:p>
+    <w:p>
+      <w:pPr>
+        <w:rPr>
+          <w:lang w:val="en-US"/>
+        </w:rPr>
+      </w:pPr>
+      <w:r>
+        <w:rPr>
+          <w:lang w:val="en-US"/>
+        </w:rPr>
+        <w:t>[CV] END max_epochs=50, module__hidden_size=50, module__num_layers=3, optimizer__lr=0.001; total time= 1.6min</w:t>
+      </w:r>
+    </w:p>
+    <w:p>
+      <w:pPr>
+        <w:rPr>
+          <w:lang w:val="en-US"/>
+        </w:rPr>
+      </w:pPr>
+      <w:r>
+        <w:rPr>
+          <w:lang w:val="en-US"/>
+        </w:rPr>
+        <w:t>[CV] END max_epochs=50, module__hidden_size=50, module__num_layers=3, optimizer__lr=0.001; total time= 3.2min</w:t>
+      </w:r>
+    </w:p>
+    <w:p>
+      <w:pPr>
+        <w:rPr>
+          <w:lang w:val="en-US"/>
+        </w:rPr>
+      </w:pPr>
+      <w:r>
+        <w:rPr>
+          <w:lang w:val="en-US"/>
+        </w:rPr>
+        <w:t>[CV] END max_epochs=50, module__hidden_size=50, module__num_layers=3, optimizer__lr=0.001; total time= 4.8min</w:t>
+      </w:r>
+    </w:p>
+    <w:p>
+      <w:pPr>
+        <w:rPr>
+          <w:lang w:val="en-US"/>
+        </w:rPr>
+      </w:pPr>
+      <w:r>
+        <w:rPr>
+          <w:lang w:val="en-US"/>
+        </w:rPr>
+        <w:t>[CV] END max_epochs=50, module__hidden_size=50, module__num_layers=3, optimizer__lr=0.01; total time= 1.6min</w:t>
+      </w:r>
+    </w:p>
+    <w:p>
+      <w:pPr>
+        <w:rPr>
+          <w:lang w:val="en-US"/>
+        </w:rPr>
+      </w:pPr>
+      <w:r>
+        <w:rPr>
+          <w:lang w:val="en-US"/>
+        </w:rPr>
+        <w:t>[CV] END max_epochs=50, module__hidden_size=50, module__num_layers=3, optimizer__lr=0.01; total time= 3.2min</w:t>
+      </w:r>
+    </w:p>
+    <w:p>
+      <w:pPr>
+        <w:rPr>
+          <w:lang w:val="en-US"/>
+        </w:rPr>
+      </w:pPr>
+      <w:r>
+        <w:rPr>
+          <w:lang w:val="en-US"/>
+        </w:rPr>
+        <w:t>[CV] END max_epochs=50, module__hidden_size=50, module__num_layers=3, optimizer__lr=0.01; total time= 5.0min</w:t>
+      </w:r>
+    </w:p>
+    <w:p>
+      <w:pPr>
+        <w:rPr>
+          <w:lang w:val="en-US"/>
+        </w:rPr>
+      </w:pPr>
+      <w:r>
+        <w:rPr>
+          <w:lang w:val="en-US"/>
+        </w:rPr>
+        <w:lastRenderedPageBreak/>
+        <w:t>[CV] END max_epochs=100, module__hidden_size=20, module__num_layers=1, optimizer__lr=0.001; total time=  56.3s</w:t>
+      </w:r>
+    </w:p>
+    <w:p>
+      <w:pPr>
+        <w:rPr>
+          <w:lang w:val="en-US"/>
+        </w:rPr>
+      </w:pPr>
+      <w:r>
+        <w:rPr>
+          <w:lang w:val="en-US"/>
+        </w:rPr>
+        <w:t>[CV] END max_epochs=100, module__hidden_size=20, module__num_layers=1, optimizer__lr=0.001; total time= 1.9min</w:t>
+      </w:r>
+    </w:p>
+    <w:p>
+      <w:pPr>
+        <w:rPr>
+          <w:lang w:val="en-US"/>
+        </w:rPr>
+      </w:pPr>
+      <w:r>
+        <w:rPr>
+          <w:lang w:val="en-US"/>
+        </w:rPr>
+        <w:t>[CV] END max_epochs=100, module__hidden_size=20, module__num_layers=1, optimizer__lr=0.001; total time= 2.7min</w:t>
+      </w:r>
+    </w:p>
+    <w:p>
+      <w:pPr>
+        <w:rPr>
+          <w:lang w:val="en-US"/>
+        </w:rPr>
+      </w:pPr>
+      <w:r>
+        <w:rPr>
+          <w:lang w:val="en-US"/>
+        </w:rPr>
+        <w:t>[CV] END max_epochs=100, module__hidden_size=20, module__num_layers=1, optimizer__lr=0.01; total time=  54.4s</w:t>
+      </w:r>
+    </w:p>
+    <w:p>
+      <w:pPr>
+        <w:rPr>
+          <w:lang w:val="en-US"/>
+        </w:rPr>
+      </w:pPr>
+      <w:r>
+        <w:rPr>
+          <w:lang w:val="en-US"/>
+        </w:rPr>
+        <w:t>[CV] END max_epochs=100, module__hidden_size=20, module__num_layers=1, optimizer__lr=0.01; total time= 1.8min</w:t>
+      </w:r>
+    </w:p>
+    <w:p>
+      <w:pPr>
+        <w:rPr>
+          <w:lang w:val="en-US"/>
+        </w:rPr>
+      </w:pPr>
+      <w:r>
+        <w:rPr>
+          <w:lang w:val="en-US"/>
+        </w:rPr>
+        <w:t>[CV] END max_epochs=100, module__hidden_size=20, module__num_layers=1, optimizer__lr=0.01; total time= 2.7min</w:t>
+      </w:r>
+    </w:p>
+    <w:p>
+      <w:pPr>
+        <w:rPr>
+          <w:lang w:val="en-US"/>
+        </w:rPr>
+      </w:pPr>
+      <w:r>
+        <w:rPr>
+          <w:lang w:val="en-US"/>
+        </w:rPr>
+        <w:t>[CV] END max_epochs=100, module__hidden_size=20, module__num_layers=2, optimizer__lr=0.001; total time= 1.6min</w:t>
+      </w:r>
+    </w:p>
+    <w:p>
+      <w:pPr>
+        <w:rPr>
+          <w:lang w:val="en-US"/>
+        </w:rPr>
+      </w:pPr>
+      <w:r>
+        <w:rPr>
+          <w:lang w:val="en-US"/>
+        </w:rPr>
+        <w:t>[CV] END max_epochs=100, module__hidden_size=20, module__num_layers=2, optimizer__lr=0.001; total time= 3.2min</w:t>
+      </w:r>
+    </w:p>
+    <w:p>
+      <w:pPr>
+        <w:rPr>
+          <w:lang w:val="en-US"/>
+        </w:rPr>
+      </w:pPr>
+      <w:r>
+        <w:rPr>
+          <w:lang w:val="en-US"/>
+        </w:rPr>
+        <w:t>[CV] END max_epochs=100, module__hidden_size=20, module__num_layers=2, optimizer__lr=0.001; total time= 4.8min</w:t>
+      </w:r>
+    </w:p>
+    <w:p>
+      <w:pPr>
+        <w:rPr>
+          <w:lang w:val="en-US"/>
+        </w:rPr>
+      </w:pPr>
+      <w:r>
+        <w:rPr>
+          <w:lang w:val="en-US"/>
+        </w:rPr>
+        <w:t>[CV] END max_epochs=100, module__hidden_size=20, module__num_layers=2, optimizer__lr=0.01; total time= 1.7min</w:t>
+      </w:r>
+    </w:p>
+    <w:p>
+      <w:pPr>
+        <w:rPr>
+          <w:lang w:val="en-US"/>
+        </w:rPr>
+      </w:pPr>
+      <w:r>
+        <w:rPr>
+          <w:lang w:val="en-US"/>
+        </w:rPr>
+        <w:t>[CV] END max_epochs=100, module__hidden_size=20, module__num_layers=2, optimizer__lr=0.01; total time= 3.2min</w:t>
+      </w:r>
+    </w:p>
+    <w:p>
+      <w:pPr>
+        <w:rPr>
+          <w:lang w:val="en-US"/>
+        </w:rPr>
+      </w:pPr>
+      <w:r>
+        <w:rPr>
+          <w:lang w:val="en-US"/>
+        </w:rPr>
+        <w:t>[CV] END max_epochs=100, module__hidden_size=20, module__num_layers=2, optimizer__lr=0.01; total time= 4.8min</w:t>
+      </w:r>
+    </w:p>
+    <w:p>
+      <w:pPr>
+        <w:rPr>
+          <w:lang w:val="en-US"/>
+        </w:rPr>
+      </w:pPr>
+      <w:r>
+        <w:rPr>
+          <w:lang w:val="en-US"/>
+        </w:rPr>
+        <w:t>[CV] END max_epochs=100, module__hidden_size=20, module__num_layers=3, optimizer__lr=0.001; total time= 2.3min</w:t>
+      </w:r>
+    </w:p>
+    <w:p>
+      <w:pPr>
+        <w:rPr>
+          <w:lang w:val="en-US"/>
+        </w:rPr>
+      </w:pPr>
+      <w:r>
+        <w:rPr>
+          <w:lang w:val="en-US"/>
+        </w:rPr>
+        <w:t>[CV] END max_epochs=100, module__hidden_size=20, module__num_layers=3, optimizer__lr=0.001; total time= 4.5min</w:t>
+      </w:r>
+    </w:p>
+    <w:p>
+      <w:pPr>
+        <w:rPr>
+          <w:lang w:val="en-US"/>
+        </w:rPr>
+      </w:pPr>
+      <w:r>
+        <w:rPr>
+          <w:lang w:val="en-US"/>
+        </w:rPr>
+        <w:t>[CV] END max_epochs=100, module__hidden_size=20, module__num_layers=3, optimizer__lr=0.001; total time= 6.7min</w:t>
+      </w:r>
+    </w:p>
+    <w:p>
+      <w:pPr>
+        <w:rPr>
+          <w:lang w:val="en-US"/>
+        </w:rPr>
+      </w:pPr>
+      <w:r>
+        <w:rPr>
+          <w:lang w:val="en-US"/>
+        </w:rPr>
+        <w:t>[CV] END max_epochs=100, module__hidden_size=20, module__num_layers=3, optimizer__lr=0.01; total time= 2.3min</w:t>
+      </w:r>
+    </w:p>
+    <w:p>
+      <w:pPr>
+        <w:rPr>
+          <w:lang w:val="en-US"/>
+        </w:rPr>
+      </w:pPr>
+      <w:r>
+        <w:rPr>
+          <w:lang w:val="en-US"/>
+        </w:rPr>
+        <w:t>[CV] END max_epochs=100, module__hidden_size=20, module__num_layers=3, optimizer__lr=0.01; total time= 4.5min</w:t>
+      </w:r>
+    </w:p>
+    <w:p>
+      <w:pPr>
+        <w:rPr>
+          <w:lang w:val="en-US"/>
+        </w:rPr>
+      </w:pPr>
+      <w:r>
+        <w:rPr>
+          <w:lang w:val="en-US"/>
+        </w:rPr>
+        <w:t>[CV] END max_epochs=100, module__hidden_size=20, module__num_layers=3, optimizer__lr=0.01; total time= 8.1min</w:t>
+      </w:r>
+    </w:p>
+    <w:p>
+      <w:pPr>
+        <w:rPr>
+          <w:lang w:val="en-US"/>
+        </w:rPr>
+      </w:pPr>
+      <w:r>
+        <w:rPr>
+          <w:lang w:val="en-US"/>
+        </w:rPr>
+        <w:t>[CV] END max_epochs=100, module__hidden_size=50, module__num_layers=1, optimizer__lr=0.001; total time= 1.3min</w:t>
+      </w:r>
+    </w:p>
+    <w:p>
+      <w:pPr>
+        <w:rPr>
+          <w:lang w:val="en-US"/>
+        </w:rPr>
+      </w:pPr>
+      <w:r>
+        <w:rPr>
+          <w:lang w:val="en-US"/>
+        </w:rPr>
+        <w:lastRenderedPageBreak/>
+        <w:t>[CV] END max_epochs=100, module__hidden_size=50, module__num_layers=1, optimizer__lr=0.001; total time= 2.5min</w:t>
+      </w:r>
+    </w:p>
+    <w:p>
+      <w:pPr>
+        <w:rPr>
+          <w:lang w:val="en-US"/>
+        </w:rPr>
+      </w:pPr>
+      <w:r>
+        <w:rPr>
+          <w:lang w:val="en-US"/>
+        </w:rPr>
+        <w:t>[CV] END max_epochs=100, module__hidden_size=50, module__num_layers=1, optimizer__lr=0.001; total time= 3.6min</w:t>
+      </w:r>
+    </w:p>
+    <w:p>
+      <w:pPr>
+        <w:rPr>
+          <w:lang w:val="en-US"/>
+        </w:rPr>
+      </w:pPr>
+      <w:r>
+        <w:rPr>
+          <w:lang w:val="en-US"/>
+        </w:rPr>
+        <w:t>[CV] END max_epochs=100, module__hidden_size=50, module__num_layers=1, optimizer__lr=0.01; total time= 1.2min</w:t>
+      </w:r>
+    </w:p>
+    <w:p>
+      <w:pPr>
+        <w:rPr>
+          <w:lang w:val="en-US"/>
+        </w:rPr>
+      </w:pPr>
+      <w:r>
+        <w:rPr>
+          <w:lang w:val="en-US"/>
+        </w:rPr>
+        <w:t>[CV] END max_epochs=100, module__hidden_size=50, module__num_layers=1, optimizer__lr=0.01; total time= 2.1min</w:t>
+      </w:r>
+    </w:p>
+    <w:p>
+      <w:pPr>
+        <w:rPr>
+          <w:lang w:val="en-US"/>
+        </w:rPr>
+      </w:pPr>
+      <w:r>
+        <w:rPr>
+          <w:lang w:val="en-US"/>
+        </w:rPr>
+        <w:t>[CV] END max_epochs=100, module__hidden_size=50, module__num_layers=1, optimizer__lr=0.01; total time= 3.6min</w:t>
+      </w:r>
+    </w:p>
+    <w:p>
+      <w:pPr>
+        <w:rPr>
+          <w:lang w:val="en-US"/>
+        </w:rPr>
+      </w:pPr>
+      <w:r>
+        <w:rPr>
+          <w:lang w:val="en-US"/>
+        </w:rPr>
+        <w:t>[CV] END max_epochs=100, module__hidden_size=50, module__num_layers=2, optimizer__lr=0.001; total time= 2.3min</w:t>
+      </w:r>
+    </w:p>
+    <w:p>
+      <w:pPr>
+        <w:rPr>
+          <w:lang w:val="en-US"/>
+        </w:rPr>
+      </w:pPr>
+      <w:r>
+        <w:rPr>
+          <w:lang w:val="en-US"/>
+        </w:rPr>
+        <w:t>[CV] END max_epochs=100, module__hidden_size=50, module__num_layers=2, optimizer__lr=0.001; total time= 4.1min</w:t>
+      </w:r>
+    </w:p>
+    <w:p>
+      <w:pPr>
+        <w:rPr>
+          <w:lang w:val="en-US"/>
+        </w:rPr>
+      </w:pPr>
+      <w:r>
+        <w:rPr>
+          <w:lang w:val="en-US"/>
+        </w:rPr>
+        <w:t>[CV] END max_epochs=100, module__hidden_size=50, module__num_layers=2, optimizer__lr=0.001; total time= 6.3min</w:t>
+      </w:r>
+    </w:p>
+    <w:p>
+      <w:pPr>
+        <w:rPr>
+          <w:lang w:val="en-US"/>
+        </w:rPr>
+      </w:pPr>
+      <w:r>
+        <w:rPr>
+          <w:lang w:val="en-US"/>
+        </w:rPr>
+        <w:t>[CV] END max_epochs=100, module__hidden_size=50, module__num_layers=2, optimizer__lr=0.01; total time= 2.0min</w:t>
+      </w:r>
+    </w:p>
+    <w:p>
+      <w:pPr>
+        <w:rPr>
+          <w:lang w:val="en-US"/>
+        </w:rPr>
+      </w:pPr>
+      <w:r>
+        <w:rPr>
+          <w:lang w:val="en-US"/>
+        </w:rPr>
+        <w:t>[CV] END max_epochs=100, module__hidden_size=50, module__num_layers=2, optimizer__lr=0.01; total time= 4.0min</w:t>
+      </w:r>
+    </w:p>
+    <w:p>
+      <w:pPr>
+        <w:rPr>
+          <w:lang w:val="en-US"/>
+        </w:rPr>
+      </w:pPr>
+      <w:r>
+        <w:rPr>
+          <w:lang w:val="en-US"/>
+        </w:rPr>
+        <w:t>[CV] END max_epochs=100, module__hidden_size=50, module__num_layers=2, optimizer__lr=0.01; total time= 6.4min</w:t>
+      </w:r>
+    </w:p>
+    <w:p>
+      <w:pPr>
+        <w:rPr>
+          <w:lang w:val="en-US"/>
+        </w:rPr>
+      </w:pPr>
+      <w:r>
+        <w:rPr>
+          <w:lang w:val="en-US"/>
+        </w:rPr>
+        <w:t>[CV] END max_epochs=100, module__hidden_size=50, module__num_layers=3, optimizer__lr=0.001; total time= 3.0min</w:t>
+      </w:r>
+    </w:p>
+    <w:p>
+      <w:pPr>
+        <w:rPr>
+          <w:lang w:val="en-US"/>
+        </w:rPr>
+      </w:pPr>
+      <w:r>
+        <w:rPr>
+          <w:lang w:val="en-US"/>
+        </w:rPr>
+        <w:t>[CV] END max_epochs=100, module__hidden_size=50, module__num_layers=3, optimizer__lr=0.001; total time= 5.8min</w:t>
+      </w:r>
+    </w:p>
+    <w:p>
+      <w:pPr>
+        <w:rPr>
+          <w:lang w:val="en-US"/>
+        </w:rPr>
+      </w:pPr>
+      <w:r>
+        <w:rPr>
+          <w:lang w:val="en-US"/>
+        </w:rPr>
+        <w:t>[CV] END max_epochs=100, module__hidden_size=50, module__num_layers=3, optimizer__lr=0.001; total time= 9.0min</w:t>
+      </w:r>
+    </w:p>
+    <w:p>
+      <w:pPr>
+        <w:rPr>
+          <w:lang w:val="en-US"/>
+        </w:rPr>
+      </w:pPr>
+      <w:r>
+        <w:rPr>
+          <w:lang w:val="en-US"/>
+        </w:rPr>
+        <w:t>[CV] END max_epochs=100, module__hidden_size=50, module__num_layers=3, optimizer__lr=0.01; total time= 3.3min</w:t>
+      </w:r>
+    </w:p>
+    <w:p>
+      <w:pPr>
+        <w:rPr>
+          <w:lang w:val="en-US"/>
+        </w:rPr>
+      </w:pPr>
+      <w:r>
+        <w:rPr>
+          <w:lang w:val="en-US"/>
+        </w:rPr>
+        <w:t>[CV] END max_epochs=100, module__hidden_size=50, module__num_layers=3, optimizer__lr=0.01; total time= 6.2min</w:t>
+      </w:r>
+    </w:p>
+    <w:p>
+      <w:pPr>
+        <w:rPr>
+          <w:lang w:val="en-US"/>
+        </w:rPr>
+      </w:pPr>
+      <w:r>
+        <w:rPr>
+          <w:lang w:val="en-US"/>
+        </w:rPr>
+        <w:t>[CV] END max_epochs=100, module__hidden_size=50, module__num_layers=3, optimizer__lr=0.01; total time= 9.4min</w:t>
+      </w:r>
+    </w:p>
+    <w:p>
+      <w:pPr>
+        <w:rPr>
+          <w:lang w:val="en-US"/>
+        </w:rPr>
+      </w:pPr>
+      <w:r>
+        <w:rPr>
+          <w:lang w:val="en-US"/>
+        </w:rPr>
+        <w:t>Melhores hiperparâmetros encontrados: {'max_epochs': 100, 'module__hidden_size': 20, 'module__num_layers': 3, 'optimizer__lr': 0.001}</w:t>
+      </w:r>
+    </w:p>
+    <w:p>
+      <w:r>
+        <w:t>Melhor MSE: -0.0031275654522081218</w:t>
+      </w:r>
+    </w:p>
+    <w:p/>
+    <w:p>
+      <w:r>
+        <w:t>TABELA COMPARATIVA DE HIPERPARÂMETROS</w:t>
+      </w:r>
+    </w:p>
+    <w:p>
+      <w:r>
+        <w:t xml:space="preserve">    Épocas  Neurônios  Camadas  Taxa de aprendizado (LR)       MSE</w:t>
+      </w:r>
+    </w:p>
+    <w:p>
+      <w:r>
+        <w:t>0      100         20        3                     0.001  0.003128</w:t>
+      </w:r>
+    </w:p>
+    <w:p>
+      <w:r>
+        <w:t>1      100         20        2                     0.001  0.003132</w:t>
+      </w:r>
+    </w:p>
+    <w:p>
+      <w:r>
+        <w:t>2      100         50        3                     0.010  0.003135</w:t>
+      </w:r>
+    </w:p>
+    <w:p>
+      <w:r>
+        <w:t>3      100         50        2                     0.010  0.003136</w:t>
+      </w:r>
+    </w:p>
+    <w:p>
+      <w:r>
+        <w:t>4      100         50        1                     0.010  0.003139</w:t>
+      </w:r>
+    </w:p>
+    <w:p>
+      <w:r>
+        <w:t>5      100         20        1                     0.010  0.003139</w:t>
+      </w:r>
+    </w:p>
+    <w:p>
+      <w:r>
+        <w:t>6       50         50        3                     0.010  0.003142</w:t>
+      </w:r>
+    </w:p>
+    <w:p>
+      <w:r>
+        <w:t>7       50         20        2                     0.001  0.003144</w:t>
+      </w:r>
+    </w:p>
+    <w:p>
+      <w:r>
+        <w:t>8      100         50        3                     0.001  0.003146</w:t>
+      </w:r>
+    </w:p>
+    <w:p>
+      <w:r>
+        <w:t>9      100         50        2                     0.001  0.003146</w:t>
+      </w:r>
+    </w:p>
+    <w:p>
+      <w:r>
+        <w:t>10     100         20        1                     0.001  0.003148</w:t>
+      </w:r>
+    </w:p>
+    <w:p>
+      <w:r>
+        <w:t>11     100         20        2                     0.010  0.003151</w:t>
+      </w:r>
+    </w:p>
+    <w:p>
+      <w:r>
+        <w:t>12      50         20        3                     0.001  0.003160</w:t>
+      </w:r>
+    </w:p>
+    <w:p>
+      <w:r>
+        <w:t>13     100         20        3                     0.010  0.003162</w:t>
+      </w:r>
+    </w:p>
+    <w:p>
+      <w:r>
+        <w:t>14     100         50        1                     0.001  0.003165</w:t>
+      </w:r>
+    </w:p>
+    <w:p>
+      <w:r>
+        <w:t>15      50         20        2                     0.010  0.003173</w:t>
+      </w:r>
+    </w:p>
+    <w:p>
+      <w:r>
+        <w:t>16      20         20        2                     0.001  0.003177</w:t>
+      </w:r>
+    </w:p>
+    <w:p>
+      <w:r>
+        <w:t>17      50         50        1                     0.001  0.003178</w:t>
+      </w:r>
+    </w:p>
+    <w:p>
+      <w:r>
+        <w:t>18      50         20        1                     0.001  0.003181</w:t>
+      </w:r>
+    </w:p>
+    <w:p>
+      <w:r>
+        <w:t>19      50         50        2                     0.001  0.003182</w:t>
+      </w:r>
+    </w:p>
+    <w:p>
+      <w:r>
+        <w:t>20      20         20        1                     0.001  0.003188</w:t>
+      </w:r>
+    </w:p>
+    <w:p>
+      <w:r>
+        <w:t>21      20         20        3                     0.001  0.003191</w:t>
+      </w:r>
+    </w:p>
+    <w:p>
+      <w:r>
+        <w:t>22      20         50        3                     0.001  0.003199</w:t>
+      </w:r>
+    </w:p>
+    <w:p>
+      <w:r>
+        <w:t>23      50         20        3                     0.010  0.003202</w:t>
+      </w:r>
+    </w:p>
+    <w:p>
+      <w:r>
+        <w:t>24      20         50        1                     0.001  0.003207</w:t>
+      </w:r>
+    </w:p>
+    <w:p>
+      <w:r>
+        <w:t>25      20         50        2                     0.001  0.003207</w:t>
+      </w:r>
+    </w:p>
+    <w:p>
+      <w:r>
+        <w:t>26      50         50        2                     0.010  0.003209</w:t>
+      </w:r>
+    </w:p>
+    <w:p>
+      <w:r>
+        <w:t>27      50         50        3                     0.001  0.003209</w:t>
+      </w:r>
+    </w:p>
+    <w:p>
+      <w:r>
+        <w:lastRenderedPageBreak/>
+        <w:t>28      50         20        1                     0.010  0.003215</w:t>
+      </w:r>
+    </w:p>
+    <w:p>
+      <w:r>
+        <w:t>29      20         20        3                     0.010  0.003216</w:t>
+      </w:r>
+    </w:p>
+    <w:p>
+      <w:r>
+        <w:t>30      20         50        3                     0.010  0.003224</w:t>
+      </w:r>
+    </w:p>
+    <w:p>
+      <w:r>
+        <w:t>31      20         20        2                     0.010  0.003250</w:t>
+      </w:r>
+    </w:p>
+    <w:p>
+      <w:r>
+        <w:t>32      50         50        1                     0.010  0.003255</w:t>
+      </w:r>
+    </w:p>
+    <w:p>
+      <w:r>
+        <w:t>33      20         20        1                     0.010  0.003275</w:t>
+      </w:r>
+    </w:p>
+    <w:p>
+      <w:r>
+        <w:t>34      20         50        2                     0.010  0.003305</w:t>
+      </w:r>
+    </w:p>
+    <w:p>
+      <w:r>
+        <w:t>35      20         50        1                     0.010  0.003378</w:t>
+      </w:r>
+    </w:p>
+    <w:p>
+      <w:r>
+        <w:t>Fitting 3 folds for each of 18 candidates, totalling 54 fits</w:t>
+      </w:r>
+    </w:p>
+    <w:p>
+      <w:r>
+        <w:t>[CV] END .....................C=0.1, gamma=scale, kernel=rbf; total time=   0.0s</w:t>
+      </w:r>
+    </w:p>
+    <w:p>
+      <w:r>
+        <w:t>[CV] END .....................C=0.1, gamma=scale, kernel=rbf; total time=   0.0s</w:t>
+      </w:r>
+    </w:p>
+    <w:p>
+      <w:r>
+        <w:t>[CV] END .....................C=0.1, gamma=scale, kernel=rbf; total time=   0.0s</w:t>
+      </w:r>
+    </w:p>
+    <w:p>
+      <w:r>
+        <w:t>[CV] END ..................C=0.1, gamma=scale, kernel=linear; total time=   0.0s</w:t>
+      </w:r>
+    </w:p>
+    <w:p>
+      <w:r>
+        <w:t>[CV] END ..................C=0.1, gamma=scale, kernel=linear; total time=   0.0s</w:t>
+      </w:r>
+    </w:p>
+    <w:p>
+      <w:r>
+        <w:t>[CV] END ..................C=0.1, gamma=scale, kernel=linear; total time=   0.0s</w:t>
+      </w:r>
+    </w:p>
+    <w:p>
+      <w:r>
+        <w:t>[CV] END .....................C=0.1, gamma=0.001, kernel=rbf; total time=   0.0s</w:t>
+      </w:r>
+    </w:p>
+    <w:p>
+      <w:r>
+        <w:t>[CV] END .....................C=0.1, gamma=0.001, kernel=rbf; total time=   0.0s</w:t>
+      </w:r>
+    </w:p>
+    <w:p>
+      <w:r>
+        <w:t>[CV] END .....................C=0.1, gamma=0.001, kernel=rbf; total time=   0.0s</w:t>
+      </w:r>
+    </w:p>
+    <w:p>
+      <w:r>
+        <w:t>[CV] END ..................C=0.1, gamma=0.001, kernel=linear; total time=   0.0s</w:t>
+      </w:r>
+    </w:p>
+    <w:p>
+      <w:r>
+        <w:t>[CV] END ..................C=0.1, gamma=0.001, kernel=linear; total time=   0.0s</w:t>
+      </w:r>
+    </w:p>
+    <w:p>
+      <w:r>
+        <w:t>[CV] END ..................C=0.1, gamma=0.001, kernel=linear; total time=   0.0s</w:t>
+      </w:r>
+    </w:p>
+    <w:p>
+      <w:r>
+        <w:t>[CV] END ......................C=0.1, gamma=0.01, kernel=rbf; total time=   0.0s</w:t>
+      </w:r>
+    </w:p>
+    <w:p>
+      <w:r>
+        <w:t>[CV] END ......................C=0.1, gamma=0.01, kernel=rbf; total time=   0.0s</w:t>
+      </w:r>
+    </w:p>
+    <w:p>
+      <w:r>
+        <w:t>[CV] END ......................C=0.1, gamma=0.01, kernel=rbf; total time=   0.0s</w:t>
+      </w:r>
+    </w:p>
+    <w:p>
+      <w:r>
+        <w:t>[CV] END ...................C=0.1, gamma=0.01, kernel=linear; total time=   0.0s</w:t>
+      </w:r>
+    </w:p>
+    <w:p>
+      <w:r>
+        <w:t>[CV] END ...................C=0.1, gamma=0.01, kernel=linear; total time=   0.0s</w:t>
+      </w:r>
+    </w:p>
+    <w:p>
+      <w:r>
+        <w:t>[CV] END ...................C=0.1, gamma=0.01, kernel=linear; total time=   0.0s</w:t>
+      </w:r>
+    </w:p>
+    <w:p>
+      <w:r>
+        <w:t>[CV] END .....................C=1.0, gamma=scale, kernel=rbf; total time=   0.0s</w:t>
+      </w:r>
+    </w:p>
+    <w:p>
+      <w:r>
+        <w:t>[CV] END .....................C=1.0, gamma=scale, kernel=rbf; total time=   0.0s</w:t>
+      </w:r>
+    </w:p>
+    <w:p>
+      <w:r>
+        <w:t>[CV] END .....................C=1.0, gamma=scale, kernel=rbf; total time=   0.0s</w:t>
+      </w:r>
+    </w:p>
+    <w:p>
+      <w:r>
+        <w:t>[CV] END ..................C=1.0, gamma=scale, kernel=linear; total time=   0.0s</w:t>
+      </w:r>
+    </w:p>
+    <w:p>
+      <w:r>
+        <w:lastRenderedPageBreak/>
+        <w:t>[CV] END ..................C=1.0, gamma=scale, kernel=linear; total time=   0.0s</w:t>
+      </w:r>
+    </w:p>
+    <w:p>
+      <w:r>
+        <w:t>[CV] END ..................C=1.0, gamma=scale, kernel=linear; total time=   0.0s</w:t>
+      </w:r>
+    </w:p>
+    <w:p>
+      <w:r>
+        <w:t>[CV] END .....................C=1.0, gamma=0.001, kernel=rbf; total time=   0.0s</w:t>
+      </w:r>
+    </w:p>
+    <w:p>
+      <w:r>
+        <w:t>[CV] END .....................C=1.0, gamma=0.001, kernel=rbf; total time=   0.0s</w:t>
+      </w:r>
+    </w:p>
+    <w:p>
+      <w:r>
+        <w:t>[CV] END .....................C=1.0, gamma=0.001, kernel=rbf; total time=   0.0s</w:t>
+      </w:r>
+    </w:p>
+    <w:p>
+      <w:r>
+        <w:t>[CV] END ..................C=1.0, gamma=0.001, kernel=linear; total time=   0.0s</w:t>
+      </w:r>
+    </w:p>
+    <w:p>
+      <w:r>
+        <w:t>[CV] END ..................C=1.0, gamma=0.001, kernel=linear; total time=   0.0s</w:t>
+      </w:r>
+    </w:p>
+    <w:p>
+      <w:r>
+        <w:t>[CV] END ..................C=1.0, gamma=0.001, kernel=linear; total time=   0.0s</w:t>
+      </w:r>
+    </w:p>
+    <w:p>
+      <w:r>
+        <w:t>[CV] END ......................C=1.0, gamma=0.01, kernel=rbf; total time=   0.0s</w:t>
+      </w:r>
+    </w:p>
+    <w:p>
+      <w:r>
+        <w:t>[CV] END ......................C=1.0, gamma=0.01, kernel=rbf; total time=   0.0s</w:t>
+      </w:r>
+    </w:p>
+    <w:p>
+      <w:r>
+        <w:t>[CV] END ......................C=1.0, gamma=0.01, kernel=rbf; total time=   0.0s</w:t>
+      </w:r>
+    </w:p>
+    <w:p>
+      <w:r>
+        <w:t>[CV] END ...................C=1.0, gamma=0.01, kernel=linear; total time=   0.0s</w:t>
+      </w:r>
+    </w:p>
+    <w:p>
+      <w:r>
+        <w:t>[CV] END ...................C=1.0, gamma=0.01, kernel=linear; total time=   0.0s</w:t>
+      </w:r>
+    </w:p>
+    <w:p>
+      <w:r>
+        <w:t>[CV] END ...................C=1.0, gamma=0.01, kernel=linear; total time=   0.0s</w:t>
+      </w:r>
+    </w:p>
+    <w:p>
+      <w:r>
+        <w:t>[CV] END ....................C=10.0, gamma=scale, kernel=rbf; total time=   0.0s</w:t>
+      </w:r>
+    </w:p>
+    <w:p>
+      <w:r>
+        <w:t>[CV] END ....................C=10.0, gamma=scale, kernel=rbf; total time=   0.0s</w:t>
+      </w:r>
+    </w:p>
+    <w:p>
+      <w:r>
+        <w:t>[CV] END ....................C=10.0, gamma=scale, kernel=rbf; total time=   0.0s</w:t>
+      </w:r>
+    </w:p>
+    <w:p>
+      <w:r>
+        <w:t>[CV] END .................C=10.0, gamma=scale, kernel=linear; total time=   0.0s</w:t>
+      </w:r>
+    </w:p>
+    <w:p>
+      <w:r>
+        <w:t>[CV] END .................C=10.0, gamma=scale, kernel=linear; total time=   0.0s</w:t>
+      </w:r>
+    </w:p>
+    <w:p>
+      <w:r>
+        <w:t>[CV] END .................C=10.0, gamma=scale, kernel=linear; total time=   0.0s</w:t>
+      </w:r>
+    </w:p>
+    <w:p>
+      <w:r>
+        <w:t>[CV] END ....................C=10.0, gamma=0.001, kernel=rbf; total time=   0.0s</w:t>
+      </w:r>
+    </w:p>
+    <w:p>
+      <w:r>
+        <w:t>[CV] END ....................C=10.0, gamma=0.001, kernel=rbf; total time=   0.0s</w:t>
+      </w:r>
+    </w:p>
+    <w:p>
+      <w:r>
+        <w:t>[CV] END ....................C=10.0, gamma=0.001, kernel=rbf; total time=   0.0s</w:t>
+      </w:r>
+    </w:p>
+    <w:p>
+      <w:r>
+        <w:t>[CV] END .................C=10.0, gamma=0.001, kernel=linear; total time=   0.0s</w:t>
+      </w:r>
+    </w:p>
+    <w:p>
+      <w:r>
+        <w:t>[CV] END .................C=10.0, gamma=0.001, kernel=linear; total time=   0.0s</w:t>
+      </w:r>
+    </w:p>
+    <w:p>
+      <w:r>
+        <w:t>[CV] END .................C=10.0, gamma=0.001, kernel=linear; total time=   0.0s</w:t>
+      </w:r>
+    </w:p>
+    <w:p>
+      <w:r>
+        <w:t>[CV] END .....................C=10.0, gamma=0.01, kernel=rbf; total time=   0.0s</w:t>
+      </w:r>
+    </w:p>
+    <w:p>
+      <w:r>
+        <w:t>[CV] END .....................C=10.0, gamma=0.01, kernel=rbf; total time=   0.0s</w:t>
+      </w:r>
+    </w:p>
+    <w:p>
+      <w:r>
+        <w:t>[CV] END .....................C=10.0, gamma=0.01, kernel=rbf; total time=   0.0s</w:t>
+      </w:r>
+    </w:p>
+    <w:p>
+      <w:r>
+        <w:t>[CV] END ..................C=10.0, gamma=0.01, kernel=linear; total time=   0.0s</w:t>
+      </w:r>
+    </w:p>
+    <w:p>
+      <w:r>
+        <w:t>[CV] END ..................C=10.0, gamma=0.01, kernel=linear; total time=   0.0s</w:t>
+      </w:r>
+    </w:p>
+    <w:p>
+      <w:r>
+        <w:lastRenderedPageBreak/>
+        <w:t>[CV] END ..................C=10.0, gamma=0.01, kernel=linear; total time=   0.0s</w:t>
+      </w:r>
+    </w:p>
+    <w:p>
+      <w:r>
+        <w:t>Melhores hiperparâmetros SVR encontrados: {'C': 10.0, 'gamma': 0.001, 'kernel': 'rbf'}</w:t>
+      </w:r>
+    </w:p>
+    <w:p>
+      <w:r>
+        <w:t>Melhor MSE SVR: -0.003099647679767574</w:t>
+      </w:r>
+    </w:p>
+    <w:p/>
+    <w:p>
+      <w:r>
+        <w:t>TABELA COMPARATIVA DE HIPERPARÂMETROS SVR</w:t>
+      </w:r>
+    </w:p>
+    <w:p>
+      <w:r>
+        <w:t xml:space="preserve">    C (Regularização)  Kernel  Gamma       MSE</w:t>
+      </w:r>
+    </w:p>
+    <w:p>
+      <w:r>
+        <w:t>0                10.0     rbf  0.001  0.003100</w:t>
+      </w:r>
+    </w:p>
+    <w:p>
+      <w:r>
+        <w:t>1                 1.0     rbf   0.01  0.003100</w:t>
+      </w:r>
+    </w:p>
+    <w:p>
+      <w:r>
+        <w:t>2                 1.0     rbf  0.001  0.003107</w:t>
+      </w:r>
+    </w:p>
+    <w:p>
+      <w:r>
+        <w:t>3                 0.1     rbf   0.01  0.003107</w:t>
+      </w:r>
+    </w:p>
+    <w:p>
+      <w:r>
+        <w:t>4                 0.1     rbf  0.001  0.003108</w:t>
+      </w:r>
+    </w:p>
+    <w:p>
+      <w:r>
+        <w:t>5                 0.1  linear   0.01  0.003135</w:t>
+      </w:r>
+    </w:p>
+    <w:p>
+      <w:r>
+        <w:t>6                 0.1  linear  0.001  0.003135</w:t>
+      </w:r>
+    </w:p>
+    <w:p>
+      <w:r>
+        <w:t>7                 0.1  linear  scale  0.003135</w:t>
+      </w:r>
+    </w:p>
+    <w:p>
+      <w:r>
+        <w:t>8                10.0     rbf   0.01  0.003170</w:t>
+      </w:r>
+    </w:p>
+    <w:p>
+      <w:r>
+        <w:t>9                 0.1     rbf  scale  0.003264</w:t>
+      </w:r>
+    </w:p>
+    <w:p>
+      <w:r>
+        <w:t>10                1.0  linear   0.01  0.003287</w:t>
+      </w:r>
+    </w:p>
+    <w:p>
+      <w:r>
+        <w:t>11                1.0  linear  scale  0.003287</w:t>
+      </w:r>
+    </w:p>
+    <w:p>
+      <w:r>
+        <w:t>12                1.0  linear  0.001  0.003287</w:t>
+      </w:r>
+    </w:p>
+    <w:p>
+      <w:r>
+        <w:t>13                1.0     rbf  scale  0.003358</w:t>
+      </w:r>
+    </w:p>
+    <w:p>
+      <w:r>
+        <w:t>14               10.0     rbf  scale  0.003358</w:t>
+      </w:r>
+    </w:p>
+    <w:p>
+      <w:r>
+        <w:t>15               10.0  linear  scale  0.003359</w:t>
+      </w:r>
+    </w:p>
+    <w:p>
+      <w:r>
+        <w:t>16               10.0  linear  0.001  0.003359</w:t>
+      </w:r>
+    </w:p>
+    <w:p>
+      <w:r>
+        <w:t>17               10.0  linear   0.01  0.003359</w:t>
+      </w:r>
+    </w:p>
+    <w:p>
+      <w:r>
+        <w:t>RESULTADOS FINAIS LSTM (TESTE)</w:t>
+      </w:r>
+    </w:p>
+    <w:p>
+      <w:r>
+        <w:t>RMSE : 0.0098</w:t>
+      </w:r>
+    </w:p>
+    <w:p>
+      <w:r>
+        <w:t>MAPE : 1.2063</w:t>
+      </w:r>
+    </w:p>
+    <w:p>
+      <w:r>
+        <w:t>RESULTADOS FINAIS SVR (TESTE)</w:t>
+      </w:r>
+    </w:p>
+    <w:p>
+      <w:r>
+        <w:t>RMSE SVR: 0.0099</w:t>
+      </w:r>
+    </w:p>
+    <w:p>
+      <w:r>
+        <w:t>MAPE SVR: 1.0721</w:t>
+      </w:r>
+    </w:p>
+    <w:p/>
+    <w:p>
+      <w:r>
+        <w:lastRenderedPageBreak/>
+        <w:t>Taxa de Acerto Direcional LSTM de todo o período de teste: 51.14%</w:t>
+      </w:r>
+    </w:p>
+    <w:p>
+      <w:r>
+        <w:t>Taxa de Acerto Direcional LSTM das primeiras 10 previsões: 70.00%</w:t>
+      </w:r>
+    </w:p>
+    <w:p/>
+    <w:p>
+      <w:r>
+        <w:t>Taxa de Acerto Direcional SVR de todo o período de teste: 50.76%</w:t>
+      </w:r>
+    </w:p>
+    <w:p>
+      <w:r>
+        <w:t>Taxa de Acerto Direcional SVR das primeiras 10 previsões: 30.00%</w:t>
       </w:r>
     </w:p>
     <w:sectPr>
@@ -11929,7 +14083,7 @@
 </file>
 
 <file path=word/styles.xml><?xml version="1.0" encoding="utf-8"?>
-<w:styles xmlns:mc="http://schemas.openxmlformats.org/markup-compatibility/2006" xmlns:r="http://schemas.openxmlformats.org/officeDocument/2006/relationships" xmlns:w="http://schemas.openxmlformats.org/wordprocessingml/2006/main" xmlns:w14="http://schemas.microsoft.com/office/word/2010/wordml" xmlns:w15="http://schemas.microsoft.com/office/word/2012/wordml" xmlns:w16cex="http://schemas.microsoft.com/office/word/2018/wordml/cex" xmlns:w16cid="http://schemas.microsoft.com/office/word/2016/wordml/cid" xmlns:w16="http://schemas.microsoft.com/office/word/2018/wordml" xmlns:w16sdtdh="http://schemas.microsoft.com/office/word/2020/wordml/sdtdatahash" xmlns:w16se="http://schemas.microsoft.com/office/word/2015/wordml/symex" mc:Ignorable="w14 w15 w16se w16cid w16 w16cex w16sdtdh">
+<w:styles xmlns:mc="http://schemas.openxmlformats.org/markup-compatibility/2006" xmlns:r="http://schemas.openxmlformats.org/officeDocument/2006/relationships" xmlns:w="http://schemas.openxmlformats.org/wordprocessingml/2006/main" xmlns:w14="http://schemas.microsoft.com/office/word/2010/wordml" xmlns:w15="http://schemas.microsoft.com/office/word/2012/wordml" xmlns:w16cex="http://schemas.microsoft.com/office/word/2018/wordml/cex" xmlns:w16cid="http://schemas.microsoft.com/office/word/2016/wordml/cid" xmlns:w16="http://schemas.microsoft.com/office/word/2018/wordml" xmlns:w16du="http://schemas.microsoft.com/office/word/2023/wordml/word16du" xmlns:w16sdtdh="http://schemas.microsoft.com/office/word/2020/wordml/sdtdatahash" xmlns:w16sdtfl="http://schemas.microsoft.com/office/word/2024/wordml/sdtformatlock" xmlns:w16se="http://schemas.microsoft.com/office/word/2015/wordml/symex" mc:Ignorable="w14 w15 w16se w16cid w16 w16cex w16sdtdh w16sdtfl w16du">
   <w:docDefaults>
     <w:rPrDefault>
       <w:rPr>
@@ -12327,13 +14481,13 @@
     <w:name w:val="Normal"/>
     <w:qFormat/>
   </w:style>
-  <w:style w:type="character" w:default="1" w:styleId="Fontepargpadro">
+  <w:style w:type="character" w:default="1" w:styleId="DefaultParagraphFont">
     <w:name w:val="Default Paragraph Font"/>
     <w:uiPriority w:val="1"/>
     <w:semiHidden/>
     <w:unhideWhenUsed/>
   </w:style>
-  <w:style w:type="table" w:default="1" w:styleId="Tabelanormal">
+  <w:style w:type="table" w:default="1" w:styleId="TableNormal">
     <w:name w:val="Normal Table"/>
     <w:uiPriority w:val="99"/>
     <w:semiHidden/>
@@ -12348,7 +14502,7 @@
       </w:tblCellMar>
     </w:tblPr>
   </w:style>
-  <w:style w:type="numbering" w:default="1" w:styleId="Semlista">
+  <w:style w:type="numbering" w:default="1" w:styleId="NoList">
     <w:name w:val="No List"/>
     <w:uiPriority w:val="99"/>
     <w:semiHidden/>

</xml_diff>